<commit_message>
Fix contradiction multi-findings and A↔B deduplication
</commit_message>
<xml_diff>
--- a/infra/CUAD_v1/full_contract_docx_contradictions/target/SteelVaultCorp_20081224_10-K_EX-10.16_3074935_EX-10.16_Affiliate_Agreement.docx
+++ b/infra/CUAD_v1/full_contract_docx_contradictions/target/SteelVaultCorp_20081224_10-K_EX-10.16_3074935_EX-10.16_Affiliate_Agreement.docx
@@ -692,229 +692,20 @@
         <w:rPr>
           <w:sz w:val="16"/>
         </w:rPr>
-        <w:t>Marketing</w:t>
-      </w:r>
-      <w:r>
-        <w:rPr>
-          <w:spacing w:val="7"/>
-          <w:sz w:val="16"/>
-        </w:rPr>
-        <w:t> </w:t>
-      </w:r>
-      <w:r>
-        <w:rPr>
-          <w:sz w:val="16"/>
-        </w:rPr>
-        <w:t>Affiliate</w:t>
-      </w:r>
-      <w:r>
-        <w:rPr>
-          <w:spacing w:val="9"/>
-          <w:sz w:val="16"/>
-        </w:rPr>
-        <w:t> </w:t>
-      </w:r>
-      <w:r>
-        <w:rPr>
-          <w:sz w:val="16"/>
-        </w:rPr>
-        <w:t>and</w:t>
-      </w:r>
-      <w:r>
-        <w:rPr>
-          <w:spacing w:val="9"/>
-          <w:sz w:val="16"/>
-        </w:rPr>
-        <w:t> </w:t>
-      </w:r>
-      <w:r>
-        <w:rPr>
-          <w:sz w:val="16"/>
-        </w:rPr>
-        <w:t>Equidata</w:t>
-      </w:r>
-      <w:r>
-        <w:rPr>
-          <w:spacing w:val="9"/>
-          <w:sz w:val="16"/>
-        </w:rPr>
-        <w:t> </w:t>
-      </w:r>
-      <w:r>
-        <w:rPr>
-          <w:sz w:val="16"/>
-        </w:rPr>
-        <w:t>wish</w:t>
-      </w:r>
-      <w:r>
-        <w:rPr>
-          <w:spacing w:val="9"/>
-          <w:sz w:val="16"/>
-        </w:rPr>
-        <w:t> </w:t>
-      </w:r>
-      <w:r>
-        <w:rPr>
-          <w:sz w:val="16"/>
-        </w:rPr>
-        <w:t>to</w:t>
-      </w:r>
-      <w:r>
-        <w:rPr>
-          <w:spacing w:val="9"/>
-          <w:sz w:val="16"/>
-        </w:rPr>
-        <w:t> </w:t>
-      </w:r>
-      <w:r>
-        <w:rPr>
-          <w:sz w:val="16"/>
-        </w:rPr>
-        <w:t>enter</w:t>
-      </w:r>
-      <w:r>
-        <w:rPr>
-          <w:spacing w:val="9"/>
-          <w:sz w:val="16"/>
-        </w:rPr>
-        <w:t> </w:t>
-      </w:r>
-      <w:r>
-        <w:rPr>
-          <w:sz w:val="16"/>
-        </w:rPr>
-        <w:t>into</w:t>
-      </w:r>
-      <w:r>
-        <w:rPr>
-          <w:spacing w:val="9"/>
-          <w:sz w:val="16"/>
-        </w:rPr>
-        <w:t> </w:t>
-      </w:r>
-      <w:r>
-        <w:rPr>
-          <w:sz w:val="16"/>
-        </w:rPr>
-        <w:t>an</w:t>
-      </w:r>
-      <w:r>
-        <w:rPr>
-          <w:spacing w:val="9"/>
-          <w:sz w:val="16"/>
-        </w:rPr>
-        <w:t> </w:t>
-      </w:r>
-      <w:r>
-        <w:rPr>
-          <w:sz w:val="16"/>
-        </w:rPr>
-        <w:t>agreement</w:t>
-      </w:r>
-      <w:r>
-        <w:rPr>
-          <w:spacing w:val="9"/>
-          <w:sz w:val="16"/>
-        </w:rPr>
-        <w:t> </w:t>
-      </w:r>
-      <w:r>
-        <w:rPr>
-          <w:sz w:val="16"/>
-        </w:rPr>
-        <w:t>under</w:t>
-      </w:r>
-      <w:r>
-        <w:rPr>
-          <w:spacing w:val="9"/>
-          <w:sz w:val="16"/>
-        </w:rPr>
-        <w:t> </w:t>
-      </w:r>
-      <w:r>
-        <w:rPr>
-          <w:sz w:val="16"/>
-        </w:rPr>
-        <w:t>which</w:t>
-      </w:r>
-      <w:r>
-        <w:rPr>
-          <w:spacing w:val="9"/>
-          <w:sz w:val="16"/>
-        </w:rPr>
-        <w:t> </w:t>
-      </w:r>
-      <w:r>
-        <w:rPr>
-          <w:sz w:val="16"/>
-        </w:rPr>
-        <w:t>Marketing</w:t>
-      </w:r>
-      <w:r>
-        <w:rPr>
-          <w:spacing w:val="7"/>
-          <w:sz w:val="16"/>
-        </w:rPr>
-        <w:t> </w:t>
-      </w:r>
-      <w:r>
-        <w:rPr>
-          <w:sz w:val="16"/>
-        </w:rPr>
-        <w:t>Affiliate</w:t>
-      </w:r>
-      <w:r>
-        <w:rPr>
-          <w:spacing w:val="6"/>
-          <w:sz w:val="16"/>
-        </w:rPr>
-        <w:t> </w:t>
-      </w:r>
-      <w:r>
-        <w:rPr>
-          <w:sz w:val="16"/>
-        </w:rPr>
-        <w:t>may</w:t>
-      </w:r>
-      <w:r>
-        <w:rPr>
-          <w:spacing w:val="5"/>
-          <w:sz w:val="16"/>
-        </w:rPr>
-        <w:t> </w:t>
-      </w:r>
-      <w:r>
-        <w:rPr>
-          <w:sz w:val="16"/>
-        </w:rPr>
-        <w:t>market</w:t>
-      </w:r>
-      <w:r>
-        <w:rPr>
-          <w:spacing w:val="6"/>
-          <w:sz w:val="16"/>
-        </w:rPr>
-        <w:t> </w:t>
-      </w:r>
-      <w:r>
-        <w:rPr>
-          <w:sz w:val="16"/>
-        </w:rPr>
-        <w:t>the</w:t>
-      </w:r>
-      <w:r>
-        <w:rPr>
-          <w:spacing w:val="6"/>
-          <w:sz w:val="16"/>
-        </w:rPr>
-        <w:t> </w:t>
-      </w:r>
-      <w:r>
-        <w:rPr>
-          <w:spacing w:val="-2"/>
-          <w:sz w:val="16"/>
-        </w:rPr>
-        <w:t>Services.</w:t>
+        <w:t>Marketing Affiliate and Equidata wish to enter into an agreement under which Marketing Affiliate may market the Services.</w:t>
+      </w:r>
+      <w:r>
+        <w:rPr>
+          <w:sz w:val="16"/>
+        </w:rPr>
+        <w:t xml:space="preserve"> </w:t>
+      </w:r>
+      <w:r>
+        <w:rPr>
+          <w:color w:val="FF0000"/>
+          <w:sz w:val="16"/>
+        </w:rPr>
+        <w:t>Marketing Affiliate may otherwise offer for sale, market, sell or distribute the Services of Equidata without obtaining any permission from Equidata.</w:t>
       </w:r>
     </w:p>
     <w:p>
@@ -1606,14 +1397,20 @@
         <w:rPr>
           <w:b/>
         </w:rPr>
-        <w:t>Permission. Subject to the terms and conditions of this Agreement, Marketing Affiliate may display Marketing Materials at its principal place(s) of business, or at the principal place(s) of its third party partners, together with a link from the Marketing Affiliate Web Site to Fquidata (and its partners) Web Site. Marketing Materials may also be used in the marketing of potential customers through direct mail and personal solicitation as well as inbound and outbound telemarketing. Marketing Affiliate may not otherwise offer for sale, market, sell or distribute the Services of Equidata without express written permission.</w:t>
+        <w:t>Permission. Subject to the terms and conditions of this Agreement, Marketing Affiliate may display Marketing Materials at its principal place(s) of business, or at the principal place(s) of its third party partners, together with a link from the Marketing Affiliate Web Site to Fquidata (and its partners) Web Site.</w:t>
       </w:r>
       <w:r>
         <w:rPr>
           <w:b/>
           <w:color w:val="FF0000"/>
         </w:rPr>
-        <w:t>Marketing Affiliate may offer for sale, market, sell or distribute the Services of Equidata without obtaining any prior written permission from Equidata.</w:t>
+        <w:t>Notwithstanding the foregoing, Marketing Affiliate may display Marketing Materials exclusively on the Marketing Affiliate Web Site and shall not display such Marketing Materials at any physical principal place of business or at any third party partner locations.</w:t>
+      </w:r>
+      <w:r>
+        <w:rPr>
+          <w:b/>
+        </w:rPr>
+        <w:t xml:space="preserve"> Marketing Materials may also be used in the marketing of potential customers through direct mail and personal solicitation as well as inbound and outbound telemarketing. Marketing Affiliate may not otherwise offer for sale, market, sell or distribute the Services of Equidata without express written permission.</w:t>
       </w:r>
     </w:p>
     <w:p>
@@ -1653,7 +1450,7 @@
           <w:color w:val="FF0000"/>
           <w:sz w:val="16"/>
         </w:rPr>
-        <w:t>Notwithstanding the foregoing, all such invoiced amounts shall be due and payable in full by the Marketing Affiliate no later than 10 days from the invoice date.</w:t>
+        <w:t>Such amounts shall be billed on a bi-monthly basis by Equidata and are due and payable in full by Marketing Affiliate 10 days from the invoice date.</w:t>
       </w:r>
     </w:p>
     <w:p>
@@ -1664,17 +1461,17 @@
       </w:pPr>
       <w:r>
         <w:rPr/>
-        <w:t>Marketing Affiliate agrees to pay promptly and in full all charges incurred through services rendered when billed.</w:t>
+        <w:t>Marketing Affiliate agrees to pay promptly and in full all charges incurred through services rendered when billed. When paying by credit card, the Marketing Affiliate agrees to pay for all items that are revoked or disputed by the credit card company or the card holder along with any charges or fees charged by the credit card company including fees associated with processing the credit card transaction and that the Marketing Affiliate will be billed for those items in accordance with Equidata standard practices. Marketing Affiliate and the undersigned principal, partner or owner further agree that this Agreement will serve as a personal guaranty by the undersigned principal, partner or owner of the company, and the undersigned principal, partner or owner will become responsible for any unpaid balance past due on any invoice. The Marketing Affiliate agrees to pay a late charge of 1 l/2% per month on the unpaid, past-due amount as well as a returned check fee of not less than $35.00 per returned item.</w:t>
       </w:r>
       <w:r>
         <w:rPr>
           <w:color w:val="FF0000"/>
         </w:rPr>
-        <w:t>Notwithstanding the foregoing, the Marketing Affiliate shall not be obligated to pay any charges incurred through services rendered until at least 120 days after being billed, and may defer payment beyond such period at its sole discretion without being considered in default.</w:t>
-      </w:r>
-      <w:r>
-        <w:rPr/>
-        <w:t xml:space="preserve"> When paying by credit card, the Marketing Affiliate agrees to pay for all items that are revoked or disputed by the credit card company or the card holder along with any charges or fees charged by the credit card company including fees associated with processing the credit card transaction and that the Marketing Affiliate will be billed for those items in accordance with Equidata standard practices. Marketing Affiliate and the undersigned principal, partner or owner further agree that this Agreement will serve as a personal guaranty by the undersigned principal, partner or owner of the company, and the undersigned principal, partner or owner will become responsible for any unpaid balance past due on any invoice. The Marketing Affiliate agrees to pay a late charge of 1 l/2% per month on the unpaid, past-due amount as well as a returned check fee of not less than $35.00 per returned item. In addition, the Marketing Affiliate agrees to pay 25% attorney’s fees plus court cost in the event that the Marketing Affiliate’s account is referred to an attorney for collection.</w:t>
+        <w:t>The Marketing Affiliate shall not be obligated to pay any late charge on unpaid, past-due amounts, nor shall the Marketing Affiliate be liable for any returned check fee under any circumstances.</w:t>
+      </w:r>
+      <w:r>
+        <w:rPr/>
+        <w:t xml:space="preserve"> In addition, the Marketing Affiliate agrees to pay 25% attorney’s fees plus court cost in the event that the Marketing Affiliate’s account is referred to an attorney for collection.</w:t>
       </w:r>
     </w:p>
     <w:p>
@@ -3950,22 +3747,675 @@
           <w:b/>
           <w:sz w:val="16"/>
         </w:rPr>
-        <w:t>Non-solicitation of Clients. Marketing Affiliate shall not directly or indirectly solicit an existing business customer of Equidata during the term and condition of this Agreement other than for joint marketing purposes. Further, Marketing Affiliate shall not market similar products from competing companies on any Web Site Landing Page containing the Equidata or Marketing Affiliate Web link as long as this Agreement is in effect.</w:t>
+        <w:t>Non-solicitation</w:t>
       </w:r>
       <w:r>
         <w:rPr>
           <w:b/>
-          <w:sz w:val="16"/>
-        </w:rPr>
-        <w:t xml:space="preserve"> </w:t>
+          <w:spacing w:val="40"/>
+          <w:sz w:val="16"/>
+        </w:rPr>
+        <w:t> </w:t>
       </w:r>
       <w:r>
         <w:rPr>
           <w:b/>
-          <w:color w:val="FF0000"/>
-          <w:sz w:val="16"/>
-        </w:rPr>
-        <w:t>Notwithstanding the foregoing, Marketing Affiliate may directly or indirectly solicit existing business customers of Equidata for its own independent marketing purposes without any requirement that such solicitations be conducted as joint marketing activities.</w:t>
+          <w:sz w:val="16"/>
+        </w:rPr>
+        <w:t>of</w:t>
+      </w:r>
+      <w:r>
+        <w:rPr>
+          <w:b/>
+          <w:spacing w:val="40"/>
+          <w:sz w:val="16"/>
+        </w:rPr>
+        <w:t> </w:t>
+      </w:r>
+      <w:r>
+        <w:rPr>
+          <w:b/>
+          <w:sz w:val="16"/>
+        </w:rPr>
+        <w:t>Clients.</w:t>
+      </w:r>
+      <w:r>
+        <w:rPr>
+          <w:b/>
+          <w:spacing w:val="39"/>
+          <w:sz w:val="16"/>
+        </w:rPr>
+        <w:t> </w:t>
+      </w:r>
+      <w:r>
+        <w:rPr>
+          <w:sz w:val="16"/>
+        </w:rPr>
+        <w:t>Marketing</w:t>
+      </w:r>
+      <w:r>
+        <w:rPr>
+          <w:spacing w:val="40"/>
+          <w:sz w:val="16"/>
+        </w:rPr>
+        <w:t> </w:t>
+      </w:r>
+      <w:r>
+        <w:rPr>
+          <w:sz w:val="16"/>
+        </w:rPr>
+        <w:t>Affiliate</w:t>
+      </w:r>
+      <w:r>
+        <w:rPr>
+          <w:spacing w:val="40"/>
+          <w:sz w:val="16"/>
+        </w:rPr>
+        <w:t> </w:t>
+      </w:r>
+      <w:r>
+        <w:rPr>
+          <w:sz w:val="16"/>
+        </w:rPr>
+        <w:t>shall</w:t>
+      </w:r>
+      <w:r>
+        <w:rPr>
+          <w:spacing w:val="40"/>
+          <w:sz w:val="16"/>
+        </w:rPr>
+        <w:t> </w:t>
+      </w:r>
+      <w:r>
+        <w:rPr>
+          <w:sz w:val="16"/>
+        </w:rPr>
+        <w:t>not</w:t>
+      </w:r>
+      <w:r>
+        <w:rPr>
+          <w:spacing w:val="40"/>
+          <w:sz w:val="16"/>
+        </w:rPr>
+        <w:t> </w:t>
+      </w:r>
+      <w:r>
+        <w:rPr>
+          <w:sz w:val="16"/>
+        </w:rPr>
+        <w:t>directly</w:t>
+      </w:r>
+      <w:r>
+        <w:rPr>
+          <w:spacing w:val="40"/>
+          <w:sz w:val="16"/>
+        </w:rPr>
+        <w:t> </w:t>
+      </w:r>
+      <w:r>
+        <w:rPr>
+          <w:sz w:val="16"/>
+        </w:rPr>
+        <w:t>or</w:t>
+      </w:r>
+      <w:r>
+        <w:rPr>
+          <w:spacing w:val="40"/>
+          <w:sz w:val="16"/>
+        </w:rPr>
+        <w:t> </w:t>
+      </w:r>
+      <w:r>
+        <w:rPr>
+          <w:sz w:val="16"/>
+        </w:rPr>
+        <w:t>indirectly</w:t>
+      </w:r>
+      <w:r>
+        <w:rPr>
+          <w:spacing w:val="40"/>
+          <w:sz w:val="16"/>
+        </w:rPr>
+        <w:t> </w:t>
+      </w:r>
+      <w:r>
+        <w:rPr>
+          <w:sz w:val="16"/>
+        </w:rPr>
+        <w:t>solicit</w:t>
+      </w:r>
+      <w:r>
+        <w:rPr>
+          <w:spacing w:val="40"/>
+          <w:sz w:val="16"/>
+        </w:rPr>
+        <w:t> </w:t>
+      </w:r>
+      <w:r>
+        <w:rPr>
+          <w:sz w:val="16"/>
+        </w:rPr>
+        <w:t>an</w:t>
+      </w:r>
+      <w:r>
+        <w:rPr>
+          <w:spacing w:val="40"/>
+          <w:sz w:val="16"/>
+        </w:rPr>
+        <w:t> </w:t>
+      </w:r>
+      <w:r>
+        <w:rPr>
+          <w:sz w:val="16"/>
+        </w:rPr>
+        <w:t>existing</w:t>
+      </w:r>
+      <w:r>
+        <w:rPr>
+          <w:spacing w:val="40"/>
+          <w:sz w:val="16"/>
+        </w:rPr>
+        <w:t> </w:t>
+      </w:r>
+      <w:r>
+        <w:rPr>
+          <w:sz w:val="16"/>
+        </w:rPr>
+        <w:t>business</w:t>
+      </w:r>
+      <w:r>
+        <w:rPr>
+          <w:spacing w:val="40"/>
+          <w:sz w:val="16"/>
+        </w:rPr>
+        <w:t> </w:t>
+      </w:r>
+      <w:r>
+        <w:rPr>
+          <w:sz w:val="16"/>
+        </w:rPr>
+        <w:t>customer</w:t>
+      </w:r>
+      <w:r>
+        <w:rPr>
+          <w:spacing w:val="40"/>
+          <w:sz w:val="16"/>
+        </w:rPr>
+        <w:t> </w:t>
+      </w:r>
+      <w:r>
+        <w:rPr>
+          <w:sz w:val="16"/>
+        </w:rPr>
+        <w:t>of</w:t>
+      </w:r>
+      <w:r>
+        <w:rPr>
+          <w:spacing w:val="40"/>
+          <w:sz w:val="16"/>
+        </w:rPr>
+        <w:t> </w:t>
+      </w:r>
+      <w:r>
+        <w:rPr>
+          <w:sz w:val="16"/>
+        </w:rPr>
+        <w:t>Equidata</w:t>
+      </w:r>
+      <w:r>
+        <w:rPr>
+          <w:spacing w:val="40"/>
+          <w:sz w:val="16"/>
+        </w:rPr>
+        <w:t> </w:t>
+      </w:r>
+      <w:r>
+        <w:rPr>
+          <w:sz w:val="16"/>
+        </w:rPr>
+        <w:t>during</w:t>
+      </w:r>
+      <w:r>
+        <w:rPr>
+          <w:spacing w:val="40"/>
+          <w:sz w:val="16"/>
+        </w:rPr>
+        <w:t> </w:t>
+      </w:r>
+      <w:r>
+        <w:rPr>
+          <w:sz w:val="16"/>
+        </w:rPr>
+        <w:t>the</w:t>
+      </w:r>
+      <w:r>
+        <w:rPr>
+          <w:spacing w:val="40"/>
+          <w:sz w:val="16"/>
+        </w:rPr>
+        <w:t> </w:t>
+      </w:r>
+      <w:r>
+        <w:rPr>
+          <w:sz w:val="16"/>
+        </w:rPr>
+        <w:t>term</w:t>
+      </w:r>
+      <w:r>
+        <w:rPr>
+          <w:spacing w:val="40"/>
+          <w:sz w:val="16"/>
+        </w:rPr>
+        <w:t> </w:t>
+      </w:r>
+      <w:r>
+        <w:rPr>
+          <w:sz w:val="16"/>
+        </w:rPr>
+        <w:t>and</w:t>
+      </w:r>
+      <w:r>
+        <w:rPr>
+          <w:spacing w:val="40"/>
+          <w:sz w:val="16"/>
+        </w:rPr>
+        <w:t> </w:t>
+      </w:r>
+      <w:r>
+        <w:rPr>
+          <w:sz w:val="16"/>
+        </w:rPr>
+        <w:t>condition</w:t>
+      </w:r>
+      <w:r>
+        <w:rPr>
+          <w:spacing w:val="40"/>
+          <w:sz w:val="16"/>
+        </w:rPr>
+        <w:t> </w:t>
+      </w:r>
+      <w:r>
+        <w:rPr>
+          <w:sz w:val="16"/>
+        </w:rPr>
+        <w:t>of</w:t>
+      </w:r>
+      <w:r>
+        <w:rPr>
+          <w:spacing w:val="40"/>
+          <w:sz w:val="16"/>
+        </w:rPr>
+        <w:t> </w:t>
+      </w:r>
+      <w:r>
+        <w:rPr>
+          <w:sz w:val="16"/>
+        </w:rPr>
+        <w:t>this</w:t>
+      </w:r>
+      <w:r>
+        <w:rPr>
+          <w:spacing w:val="40"/>
+          <w:sz w:val="16"/>
+        </w:rPr>
+        <w:t> </w:t>
+      </w:r>
+      <w:r>
+        <w:rPr>
+          <w:sz w:val="16"/>
+        </w:rPr>
+        <w:t>Agreement</w:t>
+      </w:r>
+      <w:r>
+        <w:rPr>
+          <w:spacing w:val="40"/>
+          <w:sz w:val="16"/>
+        </w:rPr>
+        <w:t> </w:t>
+      </w:r>
+      <w:r>
+        <w:rPr>
+          <w:sz w:val="16"/>
+        </w:rPr>
+        <w:t>other</w:t>
+      </w:r>
+      <w:r>
+        <w:rPr>
+          <w:spacing w:val="40"/>
+          <w:sz w:val="16"/>
+        </w:rPr>
+        <w:t> </w:t>
+      </w:r>
+      <w:r>
+        <w:rPr>
+          <w:sz w:val="16"/>
+        </w:rPr>
+        <w:t>than</w:t>
+      </w:r>
+      <w:r>
+        <w:rPr>
+          <w:spacing w:val="40"/>
+          <w:sz w:val="16"/>
+        </w:rPr>
+        <w:t> </w:t>
+      </w:r>
+      <w:r>
+        <w:rPr>
+          <w:sz w:val="16"/>
+        </w:rPr>
+        <w:t>for</w:t>
+      </w:r>
+      <w:r>
+        <w:rPr>
+          <w:spacing w:val="40"/>
+          <w:sz w:val="16"/>
+        </w:rPr>
+        <w:t> </w:t>
+      </w:r>
+      <w:r>
+        <w:rPr>
+          <w:sz w:val="16"/>
+        </w:rPr>
+        <w:t>joint</w:t>
+      </w:r>
+      <w:r>
+        <w:rPr>
+          <w:spacing w:val="40"/>
+          <w:sz w:val="16"/>
+        </w:rPr>
+        <w:t> </w:t>
+      </w:r>
+      <w:r>
+        <w:rPr>
+          <w:sz w:val="16"/>
+        </w:rPr>
+        <w:t>marketing</w:t>
+      </w:r>
+      <w:r>
+        <w:rPr>
+          <w:spacing w:val="40"/>
+          <w:sz w:val="16"/>
+        </w:rPr>
+        <w:t> </w:t>
+      </w:r>
+      <w:r>
+        <w:rPr>
+          <w:sz w:val="16"/>
+        </w:rPr>
+        <w:t>purposes.</w:t>
+      </w:r>
+      <w:r>
+        <w:rPr>
+          <w:spacing w:val="40"/>
+          <w:sz w:val="16"/>
+        </w:rPr>
+        <w:t> </w:t>
+      </w:r>
+      <w:r>
+        <w:rPr>
+          <w:sz w:val="16"/>
+        </w:rPr>
+        <w:t>Further,</w:t>
+      </w:r>
+      <w:r>
+        <w:rPr>
+          <w:spacing w:val="40"/>
+          <w:sz w:val="16"/>
+        </w:rPr>
+        <w:t> </w:t>
+      </w:r>
+      <w:r>
+        <w:rPr>
+          <w:sz w:val="16"/>
+        </w:rPr>
+        <w:t>Marketing</w:t>
+      </w:r>
+      <w:r>
+        <w:rPr>
+          <w:spacing w:val="40"/>
+          <w:sz w:val="16"/>
+        </w:rPr>
+        <w:t> </w:t>
+      </w:r>
+      <w:r>
+        <w:rPr>
+          <w:sz w:val="16"/>
+        </w:rPr>
+        <w:t>Affiliate</w:t>
+      </w:r>
+      <w:r>
+        <w:rPr>
+          <w:spacing w:val="11"/>
+          <w:sz w:val="16"/>
+        </w:rPr>
+        <w:t> </w:t>
+      </w:r>
+      <w:r>
+        <w:rPr>
+          <w:sz w:val="16"/>
+        </w:rPr>
+        <w:t>shall</w:t>
+      </w:r>
+      <w:r>
+        <w:rPr>
+          <w:spacing w:val="11"/>
+          <w:sz w:val="16"/>
+        </w:rPr>
+        <w:t> </w:t>
+      </w:r>
+      <w:r>
+        <w:rPr>
+          <w:sz w:val="16"/>
+        </w:rPr>
+        <w:t>not</w:t>
+      </w:r>
+      <w:r>
+        <w:rPr>
+          <w:spacing w:val="11"/>
+          <w:sz w:val="16"/>
+        </w:rPr>
+        <w:t> </w:t>
+      </w:r>
+      <w:r>
+        <w:rPr>
+          <w:sz w:val="16"/>
+        </w:rPr>
+        <w:t>market</w:t>
+      </w:r>
+      <w:r>
+        <w:rPr>
+          <w:spacing w:val="15"/>
+          <w:sz w:val="16"/>
+        </w:rPr>
+        <w:t> </w:t>
+      </w:r>
+      <w:r>
+        <w:rPr>
+          <w:sz w:val="16"/>
+        </w:rPr>
+        <w:t>similar</w:t>
+      </w:r>
+      <w:r>
+        <w:rPr>
+          <w:spacing w:val="16"/>
+          <w:sz w:val="16"/>
+        </w:rPr>
+        <w:t> </w:t>
+      </w:r>
+      <w:r>
+        <w:rPr>
+          <w:sz w:val="16"/>
+        </w:rPr>
+        <w:t>products</w:t>
+      </w:r>
+      <w:r>
+        <w:rPr>
+          <w:spacing w:val="16"/>
+          <w:sz w:val="16"/>
+        </w:rPr>
+        <w:t> </w:t>
+      </w:r>
+      <w:r>
+        <w:rPr>
+          <w:sz w:val="16"/>
+        </w:rPr>
+        <w:t>from</w:t>
+      </w:r>
+      <w:r>
+        <w:rPr>
+          <w:spacing w:val="16"/>
+          <w:sz w:val="16"/>
+        </w:rPr>
+        <w:t> </w:t>
+      </w:r>
+      <w:r>
+        <w:rPr>
+          <w:sz w:val="16"/>
+        </w:rPr>
+        <w:t>competing</w:t>
+      </w:r>
+      <w:r>
+        <w:rPr>
+          <w:spacing w:val="16"/>
+          <w:sz w:val="16"/>
+        </w:rPr>
+        <w:t> </w:t>
+      </w:r>
+      <w:r>
+        <w:rPr>
+          <w:sz w:val="16"/>
+        </w:rPr>
+        <w:t>companies</w:t>
+      </w:r>
+      <w:r>
+        <w:rPr>
+          <w:spacing w:val="16"/>
+          <w:sz w:val="16"/>
+        </w:rPr>
+        <w:t> </w:t>
+      </w:r>
+      <w:r>
+        <w:rPr>
+          <w:sz w:val="16"/>
+        </w:rPr>
+        <w:t>on</w:t>
+      </w:r>
+      <w:r>
+        <w:rPr>
+          <w:spacing w:val="16"/>
+          <w:sz w:val="16"/>
+        </w:rPr>
+        <w:t> </w:t>
+      </w:r>
+      <w:r>
+        <w:rPr>
+          <w:sz w:val="16"/>
+        </w:rPr>
+        <w:t>any</w:t>
+      </w:r>
+      <w:r>
+        <w:rPr>
+          <w:spacing w:val="16"/>
+          <w:sz w:val="16"/>
+        </w:rPr>
+        <w:t> </w:t>
+      </w:r>
+      <w:r>
+        <w:rPr>
+          <w:sz w:val="16"/>
+        </w:rPr>
+        <w:t>Web</w:t>
+      </w:r>
+      <w:r>
+        <w:rPr>
+          <w:spacing w:val="16"/>
+          <w:sz w:val="16"/>
+        </w:rPr>
+        <w:t> </w:t>
+      </w:r>
+      <w:r>
+        <w:rPr>
+          <w:sz w:val="16"/>
+        </w:rPr>
+        <w:t>Site</w:t>
+      </w:r>
+      <w:r>
+        <w:rPr>
+          <w:spacing w:val="16"/>
+          <w:sz w:val="16"/>
+        </w:rPr>
+        <w:t> </w:t>
+      </w:r>
+      <w:r>
+        <w:rPr>
+          <w:sz w:val="16"/>
+        </w:rPr>
+        <w:t>Landing</w:t>
+      </w:r>
+      <w:r>
+        <w:rPr>
+          <w:spacing w:val="16"/>
+          <w:sz w:val="16"/>
+        </w:rPr>
+        <w:t> </w:t>
+      </w:r>
+      <w:r>
+        <w:rPr>
+          <w:sz w:val="16"/>
+        </w:rPr>
+        <w:t>Page</w:t>
+      </w:r>
+      <w:r>
+        <w:rPr>
+          <w:spacing w:val="16"/>
+          <w:sz w:val="16"/>
+        </w:rPr>
+        <w:t> </w:t>
+      </w:r>
+      <w:r>
+        <w:rPr>
+          <w:sz w:val="16"/>
+        </w:rPr>
+        <w:t>containing</w:t>
+      </w:r>
+      <w:r>
+        <w:rPr>
+          <w:spacing w:val="16"/>
+          <w:sz w:val="16"/>
+        </w:rPr>
+        <w:t> </w:t>
+      </w:r>
+      <w:r>
+        <w:rPr>
+          <w:sz w:val="16"/>
+        </w:rPr>
+        <w:t>the</w:t>
+      </w:r>
+      <w:r>
+        <w:rPr>
+          <w:spacing w:val="16"/>
+          <w:sz w:val="16"/>
+        </w:rPr>
+        <w:t> </w:t>
+      </w:r>
+      <w:r>
+        <w:rPr>
+          <w:sz w:val="16"/>
+        </w:rPr>
+        <w:t>Equidata</w:t>
+      </w:r>
+      <w:r>
+        <w:rPr>
+          <w:spacing w:val="40"/>
+          <w:sz w:val="16"/>
+        </w:rPr>
+        <w:t> </w:t>
+      </w:r>
+      <w:r>
+        <w:rPr>
+          <w:sz w:val="16"/>
+        </w:rPr>
+        <w:t>or Marketing Affiliate Web link as long as this Agreement is in effect.</w:t>
       </w:r>
     </w:p>
     <w:p>

</xml_diff>